<commit_message>
enhance CSS styles for improved UI consistency.
</commit_message>
<xml_diff>
--- a/Project Report/Chapter_One_Introduction.docx
+++ b/Project Report/Chapter_One_Introduction.docx
@@ -967,7 +967,14 @@
         <w:rPr>
           <w:rFonts w:ascii="Times New Roman" w:hAnsi="Times New Roman" w:cs="Times New Roman"/>
         </w:rPr>
-        <w:t>, which quietly prevent a</w:t>
+        <w:t xml:space="preserve">, which quietly prevent </w:t>
+      </w:r>
+      <w:proofErr w:type="spellStart"/>
+      <w:r>
+        <w:rPr>
+          <w:rFonts w:ascii="Times New Roman" w:hAnsi="Times New Roman" w:cs="Times New Roman"/>
+        </w:rPr>
+        <w:t>a</w:t>
       </w:r>
       <w:r>
         <w:rPr>
@@ -975,6 +982,7 @@
         </w:rPr>
         <w:t>lot</w:t>
       </w:r>
+      <w:proofErr w:type="spellEnd"/>
       <w:r>
         <w:rPr>
           <w:rFonts w:ascii="Times New Roman" w:hAnsi="Times New Roman" w:cs="Times New Roman"/>
@@ -1450,19 +1458,25 @@
         <w:rPr>
           <w:rFonts w:ascii="Times New Roman" w:hAnsi="Times New Roman" w:cs="Times New Roman"/>
         </w:rPr>
-        <w:t>Designing a role-based access control model to clea</w:t>
-      </w:r>
-      <w:r>
-        <w:rPr>
-          <w:rFonts w:ascii="Times New Roman" w:hAnsi="Times New Roman" w:cs="Times New Roman"/>
-        </w:rPr>
-        <w:t>r</w:t>
-      </w:r>
-      <w:r>
-        <w:rPr>
-          <w:rFonts w:ascii="Times New Roman" w:hAnsi="Times New Roman" w:cs="Times New Roman"/>
-        </w:rPr>
-        <w:t xml:space="preserve">ly </w:t>
+        <w:t>A</w:t>
+      </w:r>
+      <w:r>
+        <w:rPr>
+          <w:rFonts w:ascii="Times New Roman" w:hAnsi="Times New Roman" w:cs="Times New Roman"/>
+        </w:rPr>
+        <w:t xml:space="preserve"> role-based access control model t</w:t>
+      </w:r>
+      <w:r>
+        <w:rPr>
+          <w:rFonts w:ascii="Times New Roman" w:hAnsi="Times New Roman" w:cs="Times New Roman"/>
+        </w:rPr>
+        <w:t>hat</w:t>
+      </w:r>
+      <w:r>
+        <w:rPr>
+          <w:rFonts w:ascii="Times New Roman" w:hAnsi="Times New Roman" w:cs="Times New Roman"/>
+        </w:rPr>
+        <w:t xml:space="preserve"> </w:t>
       </w:r>
       <w:r>
         <w:rPr>
@@ -1486,7 +1500,13 @@
         <w:rPr>
           <w:rFonts w:ascii="Times New Roman" w:hAnsi="Times New Roman" w:cs="Times New Roman"/>
         </w:rPr>
-        <w:t xml:space="preserve"> administrators.</w:t>
+        <w:t xml:space="preserve"> administrators</w:t>
+      </w:r>
+      <w:r>
+        <w:rPr>
+          <w:rFonts w:ascii="Times New Roman" w:hAnsi="Times New Roman" w:cs="Times New Roman"/>
+        </w:rPr>
+        <w:t xml:space="preserve"> will be designed.</w:t>
       </w:r>
     </w:p>
     <w:p>
@@ -1506,13 +1526,31 @@
         <w:rPr>
           <w:rFonts w:ascii="Times New Roman" w:hAnsi="Times New Roman" w:cs="Times New Roman"/>
         </w:rPr>
-        <w:t>Developing a course management and approval workflow</w:t>
-      </w:r>
-      <w:r>
-        <w:rPr>
-          <w:rFonts w:ascii="Times New Roman" w:hAnsi="Times New Roman" w:cs="Times New Roman"/>
-        </w:rPr>
-        <w:t xml:space="preserve"> that allows</w:t>
+        <w:t>I will build c</w:t>
+      </w:r>
+      <w:r>
+        <w:rPr>
+          <w:rFonts w:ascii="Times New Roman" w:hAnsi="Times New Roman" w:cs="Times New Roman"/>
+        </w:rPr>
+        <w:t>ourse management and approval workflow</w:t>
+      </w:r>
+      <w:r>
+        <w:rPr>
+          <w:rFonts w:ascii="Times New Roman" w:hAnsi="Times New Roman" w:cs="Times New Roman"/>
+        </w:rPr>
+        <w:t xml:space="preserve"> </w:t>
+      </w:r>
+      <w:r>
+        <w:rPr>
+          <w:rFonts w:ascii="Times New Roman" w:hAnsi="Times New Roman" w:cs="Times New Roman"/>
+        </w:rPr>
+        <w:t>which will</w:t>
+      </w:r>
+      <w:r>
+        <w:rPr>
+          <w:rFonts w:ascii="Times New Roman" w:hAnsi="Times New Roman" w:cs="Times New Roman"/>
+        </w:rPr>
+        <w:t xml:space="preserve"> allow</w:t>
       </w:r>
       <w:r>
         <w:rPr>
@@ -1542,7 +1580,13 @@
         <w:rPr>
           <w:rFonts w:ascii="Times New Roman" w:hAnsi="Times New Roman" w:cs="Times New Roman"/>
         </w:rPr>
-        <w:t>review before publication.</w:t>
+        <w:t>review before publication</w:t>
+      </w:r>
+      <w:r>
+        <w:rPr>
+          <w:rFonts w:ascii="Times New Roman" w:hAnsi="Times New Roman" w:cs="Times New Roman"/>
+        </w:rPr>
+        <w:t>.</w:t>
       </w:r>
     </w:p>
     <w:p>
@@ -1562,19 +1606,61 @@
         <w:rPr>
           <w:rFonts w:ascii="Times New Roman" w:hAnsi="Times New Roman" w:cs="Times New Roman"/>
         </w:rPr>
-        <w:t>Implementation of secure authentication and account protection, including hashed passwords, email verification</w:t>
-      </w:r>
-      <w:r>
-        <w:rPr>
-          <w:rFonts w:ascii="Times New Roman" w:hAnsi="Times New Roman" w:cs="Times New Roman"/>
-        </w:rPr>
-        <w:t xml:space="preserve"> and</w:t>
-      </w:r>
-      <w:r>
-        <w:rPr>
-          <w:rFonts w:ascii="Times New Roman" w:hAnsi="Times New Roman" w:cs="Times New Roman"/>
-        </w:rPr>
-        <w:t xml:space="preserve"> an audit trail of sensitive actions.</w:t>
+        <w:t>S</w:t>
+      </w:r>
+      <w:r>
+        <w:rPr>
+          <w:rFonts w:ascii="Times New Roman" w:hAnsi="Times New Roman" w:cs="Times New Roman"/>
+        </w:rPr>
+        <w:t xml:space="preserve">ecure authentication and account protection </w:t>
+      </w:r>
+      <w:r>
+        <w:rPr>
+          <w:rFonts w:ascii="Times New Roman" w:hAnsi="Times New Roman" w:cs="Times New Roman"/>
+        </w:rPr>
+        <w:t>(</w:t>
+      </w:r>
+      <w:r>
+        <w:rPr>
+          <w:rFonts w:ascii="Times New Roman" w:hAnsi="Times New Roman" w:cs="Times New Roman"/>
+        </w:rPr>
+        <w:t>including hashed passwords</w:t>
+      </w:r>
+      <w:r>
+        <w:rPr>
+          <w:rFonts w:ascii="Times New Roman" w:hAnsi="Times New Roman" w:cs="Times New Roman"/>
+        </w:rPr>
+        <w:t xml:space="preserve"> </w:t>
+      </w:r>
+      <w:r>
+        <w:rPr>
+          <w:rFonts w:ascii="Times New Roman" w:hAnsi="Times New Roman" w:cs="Times New Roman"/>
+        </w:rPr>
+        <w:t>and</w:t>
+      </w:r>
+      <w:r>
+        <w:rPr>
+          <w:rFonts w:ascii="Times New Roman" w:hAnsi="Times New Roman" w:cs="Times New Roman"/>
+        </w:rPr>
+        <w:t xml:space="preserve"> an audit trail of sensitive actions</w:t>
+      </w:r>
+      <w:r>
+        <w:rPr>
+          <w:rFonts w:ascii="Times New Roman" w:hAnsi="Times New Roman" w:cs="Times New Roman"/>
+        </w:rPr>
+        <w:t>)</w:t>
+      </w:r>
+      <w:r>
+        <w:rPr>
+          <w:rFonts w:ascii="Times New Roman" w:hAnsi="Times New Roman" w:cs="Times New Roman"/>
+        </w:rPr>
+        <w:t xml:space="preserve"> will be implemented</w:t>
+      </w:r>
+      <w:r>
+        <w:rPr>
+          <w:rFonts w:ascii="Times New Roman" w:hAnsi="Times New Roman" w:cs="Times New Roman"/>
+        </w:rPr>
+        <w:t>.</w:t>
       </w:r>
     </w:p>
     <w:p>
@@ -1594,25 +1680,55 @@
         <w:rPr>
           <w:rFonts w:ascii="Times New Roman" w:hAnsi="Times New Roman" w:cs="Times New Roman"/>
         </w:rPr>
-        <w:t xml:space="preserve">Integration of a local online payment method </w:t>
-      </w:r>
-      <w:r>
-        <w:rPr>
-          <w:rFonts w:ascii="Times New Roman" w:hAnsi="Times New Roman" w:cs="Times New Roman"/>
-        </w:rPr>
-        <w:t>to</w:t>
-      </w:r>
-      <w:r>
-        <w:rPr>
-          <w:rFonts w:ascii="Times New Roman" w:hAnsi="Times New Roman" w:cs="Times New Roman"/>
-        </w:rPr>
-        <w:t xml:space="preserve"> enable free and paid enrollment</w:t>
-      </w:r>
-      <w:r>
-        <w:rPr>
-          <w:rFonts w:ascii="Times New Roman" w:hAnsi="Times New Roman" w:cs="Times New Roman"/>
-        </w:rPr>
-        <w:t xml:space="preserve">, also </w:t>
+        <w:t xml:space="preserve">A </w:t>
+      </w:r>
+      <w:r>
+        <w:rPr>
+          <w:rFonts w:ascii="Times New Roman" w:hAnsi="Times New Roman" w:cs="Times New Roman"/>
+        </w:rPr>
+        <w:t xml:space="preserve">local online payment method </w:t>
+      </w:r>
+      <w:r>
+        <w:rPr>
+          <w:rFonts w:ascii="Times New Roman" w:hAnsi="Times New Roman" w:cs="Times New Roman"/>
+        </w:rPr>
+        <w:t>t</w:t>
+      </w:r>
+      <w:r>
+        <w:rPr>
+          <w:rFonts w:ascii="Times New Roman" w:hAnsi="Times New Roman" w:cs="Times New Roman"/>
+        </w:rPr>
+        <w:t>hat</w:t>
+      </w:r>
+      <w:r>
+        <w:rPr>
+          <w:rFonts w:ascii="Times New Roman" w:hAnsi="Times New Roman" w:cs="Times New Roman"/>
+        </w:rPr>
+        <w:t xml:space="preserve"> enable</w:t>
+      </w:r>
+      <w:r>
+        <w:rPr>
+          <w:rFonts w:ascii="Times New Roman" w:hAnsi="Times New Roman" w:cs="Times New Roman"/>
+        </w:rPr>
+        <w:t>s</w:t>
+      </w:r>
+      <w:r>
+        <w:rPr>
+          <w:rFonts w:ascii="Times New Roman" w:hAnsi="Times New Roman" w:cs="Times New Roman"/>
+        </w:rPr>
+        <w:t xml:space="preserve"> free and paid </w:t>
+      </w:r>
+      <w:r>
+        <w:rPr>
+          <w:rFonts w:ascii="Times New Roman" w:hAnsi="Times New Roman" w:cs="Times New Roman"/>
+        </w:rPr>
+        <w:t>enrollment</w:t>
+      </w:r>
+      <w:r>
+        <w:rPr>
+          <w:rFonts w:ascii="Times New Roman" w:hAnsi="Times New Roman" w:cs="Times New Roman"/>
+        </w:rPr>
+        <w:t xml:space="preserve"> </w:t>
       </w:r>
       <w:r>
         <w:rPr>
@@ -1630,7 +1746,13 @@
         <w:rPr>
           <w:rFonts w:ascii="Times New Roman" w:hAnsi="Times New Roman" w:cs="Times New Roman"/>
         </w:rPr>
-        <w:t xml:space="preserve"> revenue between instructors and the platform.</w:t>
+        <w:t xml:space="preserve"> revenue between instructors and the platform</w:t>
+      </w:r>
+      <w:r>
+        <w:rPr>
+          <w:rFonts w:ascii="Times New Roman" w:hAnsi="Times New Roman" w:cs="Times New Roman"/>
+        </w:rPr>
+        <w:t xml:space="preserve"> will be integrated to support local payments.</w:t>
       </w:r>
     </w:p>
     <w:p>
@@ -1650,7 +1772,7 @@
         <w:rPr>
           <w:rFonts w:ascii="Times New Roman" w:hAnsi="Times New Roman" w:cs="Times New Roman"/>
         </w:rPr>
-        <w:t>D</w:t>
+        <w:t>I will d</w:t>
       </w:r>
       <w:r>
         <w:rPr>
@@ -1662,19 +1784,31 @@
         <w:rPr>
           <w:rFonts w:ascii="Times New Roman" w:hAnsi="Times New Roman" w:cs="Times New Roman"/>
         </w:rPr>
-        <w:t>ment of an automated assessment module with timed quizzes</w:t>
-      </w:r>
-      <w:r>
-        <w:rPr>
-          <w:rFonts w:ascii="Times New Roman" w:hAnsi="Times New Roman" w:cs="Times New Roman"/>
-        </w:rPr>
-        <w:t xml:space="preserve"> and</w:t>
-      </w:r>
-      <w:r>
-        <w:rPr>
-          <w:rFonts w:ascii="Times New Roman" w:hAnsi="Times New Roman" w:cs="Times New Roman"/>
-        </w:rPr>
-        <w:t xml:space="preserve"> tracks learner</w:t>
+        <w:t xml:space="preserve"> timed quizzes</w:t>
+      </w:r>
+      <w:r>
+        <w:rPr>
+          <w:rFonts w:ascii="Times New Roman" w:hAnsi="Times New Roman" w:cs="Times New Roman"/>
+        </w:rPr>
+        <w:t xml:space="preserve"> </w:t>
+      </w:r>
+      <w:r>
+        <w:rPr>
+          <w:rFonts w:ascii="Times New Roman" w:hAnsi="Times New Roman" w:cs="Times New Roman"/>
+        </w:rPr>
+        <w:t xml:space="preserve">module(automated) </w:t>
+      </w:r>
+      <w:r>
+        <w:rPr>
+          <w:rFonts w:ascii="Times New Roman" w:hAnsi="Times New Roman" w:cs="Times New Roman"/>
+        </w:rPr>
+        <w:t xml:space="preserve">that </w:t>
+      </w:r>
+      <w:r>
+        <w:rPr>
+          <w:rFonts w:ascii="Times New Roman" w:hAnsi="Times New Roman" w:cs="Times New Roman"/>
+        </w:rPr>
+        <w:t>tracks learner</w:t>
       </w:r>
       <w:r>
         <w:rPr>
@@ -1706,7 +1840,25 @@
         <w:rPr>
           <w:rFonts w:ascii="Times New Roman" w:hAnsi="Times New Roman" w:cs="Times New Roman"/>
         </w:rPr>
-        <w:t>Evaluating the system</w:t>
+        <w:t>I will e</w:t>
+      </w:r>
+      <w:r>
+        <w:rPr>
+          <w:rFonts w:ascii="Times New Roman" w:hAnsi="Times New Roman" w:cs="Times New Roman"/>
+        </w:rPr>
+        <w:t>valuat</w:t>
+      </w:r>
+      <w:r>
+        <w:rPr>
+          <w:rFonts w:ascii="Times New Roman" w:hAnsi="Times New Roman" w:cs="Times New Roman"/>
+        </w:rPr>
+        <w:t>e</w:t>
+      </w:r>
+      <w:r>
+        <w:rPr>
+          <w:rFonts w:ascii="Times New Roman" w:hAnsi="Times New Roman" w:cs="Times New Roman"/>
+        </w:rPr>
+        <w:t xml:space="preserve"> the system</w:t>
       </w:r>
       <w:r>
         <w:rPr>
@@ -1724,7 +1876,7 @@
         <w:rPr>
           <w:rFonts w:ascii="Times New Roman" w:hAnsi="Times New Roman" w:cs="Times New Roman"/>
         </w:rPr>
-        <w:t>functionality</w:t>
+        <w:t>performance</w:t>
       </w:r>
       <w:r>
         <w:rPr>
@@ -2419,7 +2571,27 @@
           <w:sz w:val="26"/>
           <w:szCs w:val="26"/>
         </w:rPr>
-        <w:t>1.8 Organisation of the Report</w:t>
+        <w:t xml:space="preserve">1.8 </w:t>
+      </w:r>
+      <w:proofErr w:type="spellStart"/>
+      <w:r>
+        <w:rPr>
+          <w:rFonts w:ascii="Times New Roman" w:hAnsi="Times New Roman" w:cs="Times New Roman"/>
+          <w:b/>
+          <w:sz w:val="26"/>
+          <w:szCs w:val="26"/>
+        </w:rPr>
+        <w:t>Organisation</w:t>
+      </w:r>
+      <w:proofErr w:type="spellEnd"/>
+      <w:r>
+        <w:rPr>
+          <w:rFonts w:ascii="Times New Roman" w:hAnsi="Times New Roman" w:cs="Times New Roman"/>
+          <w:b/>
+          <w:sz w:val="26"/>
+          <w:szCs w:val="26"/>
+        </w:rPr>
+        <w:t xml:space="preserve"> of the Report</w:t>
       </w:r>
     </w:p>
     <w:p>
@@ -2433,7 +2605,21 @@
         <w:rPr>
           <w:rFonts w:ascii="Times New Roman" w:hAnsi="Times New Roman" w:cs="Times New Roman"/>
         </w:rPr>
-        <w:t>The report is organised into five chapters.</w:t>
+        <w:t xml:space="preserve">The report is </w:t>
+      </w:r>
+      <w:proofErr w:type="spellStart"/>
+      <w:r>
+        <w:rPr>
+          <w:rFonts w:ascii="Times New Roman" w:hAnsi="Times New Roman" w:cs="Times New Roman"/>
+        </w:rPr>
+        <w:t>organised</w:t>
+      </w:r>
+      <w:proofErr w:type="spellEnd"/>
+      <w:r>
+        <w:rPr>
+          <w:rFonts w:ascii="Times New Roman" w:hAnsi="Times New Roman" w:cs="Times New Roman"/>
+        </w:rPr>
+        <w:t xml:space="preserve"> into five chapters.</w:t>
       </w:r>
     </w:p>
     <w:p>
@@ -2483,7 +2669,21 @@
         <w:rPr>
           <w:rFonts w:ascii="Times New Roman" w:hAnsi="Times New Roman" w:cs="Times New Roman"/>
         </w:rPr>
-        <w:t xml:space="preserve"> its limitations. It also describes how the report is organised.</w:t>
+        <w:t xml:space="preserve"> its limitations. It also describes how the report is </w:t>
+      </w:r>
+      <w:proofErr w:type="spellStart"/>
+      <w:r>
+        <w:rPr>
+          <w:rFonts w:ascii="Times New Roman" w:hAnsi="Times New Roman" w:cs="Times New Roman"/>
+        </w:rPr>
+        <w:t>organised</w:t>
+      </w:r>
+      <w:proofErr w:type="spellEnd"/>
+      <w:r>
+        <w:rPr>
+          <w:rFonts w:ascii="Times New Roman" w:hAnsi="Times New Roman" w:cs="Times New Roman"/>
+        </w:rPr>
+        <w:t>.</w:t>
       </w:r>
     </w:p>
     <w:p>

</xml_diff>